<commit_message>
Fix DOCX image clipping and occasional blank pages
Diagrams were embedded at their native pixel size (mermaid-cli's
print-quality renders run 15-25in wide at 96dpi), so any renderer
producing a fixed page clipped the overflow instead of scaling it down.
Now sized explicitly per image to fit one page. Also removed the manual
page breaks between sections, which occasionally left a genuinely blank
page when the prior section happened to end exactly at a page boundary,
in favor of page-break-before on the Heading 1 style, guaranteeing
exactly one break per section regardless of prior page fill.

Co-Authored-By: Claude Sonnet 5 <noreply@anthropic.com>
Claude-Session: https://claude.ai/code/session_011cKHpz3RU2WuFycyeKWv9r
</commit_message>
<xml_diff>
--- a/Sales-Blueprint/exports/docx/sales-blueprint.docx
+++ b/Sales-Blueprint/exports/docx/sales-blueprint.docx
@@ -49,11 +49,6 @@
         </w:drawing>
       </w:r>
     </w:p>
-    <w:p>
-      <w:r>
-        <w:br w:type="page"/>
-      </w:r>
-    </w:p>
     <w:bookmarkStart w:id="23" w:name="contents"/>
     <w:p>
       <w:pPr>
@@ -772,11 +767,6 @@
         <w:t xml:space="preserve">Cover design and interior layout by SSO Publishing.</w:t>
       </w:r>
     </w:p>
-    <w:p>
-      <w:r>
-        <w:br w:type="page"/>
-      </w:r>
-    </w:p>
     <w:bookmarkEnd w:id="23"/>
     <w:bookmarkStart w:id="24" w:name="disclaimer"/>
     <w:p>
@@ -811,11 +801,6 @@
         <w:t xml:space="preserve">Kestrel Office Interiors, Priya Shah, and every person, conversation, and event used in this book's running case study are fictional. They were created to demonstrate the Blueprint Framework in a connected, realistic setting. Any resemblance to an actual business or person, living or dead, is coincidental.</w:t>
       </w:r>
     </w:p>
-    <w:p>
-      <w:r>
-        <w:br w:type="page"/>
-      </w:r>
-    </w:p>
     <w:bookmarkEnd w:id="24"/>
     <w:bookmarkStart w:id="25" w:name="dedication"/>
     <w:p>
@@ -850,11 +835,6 @@
         <w:t xml:space="preserve">And for the customers who said no, kindly or otherwise. You taught me more about this framework than any client who said yes ever did.</w:t>
       </w:r>
     </w:p>
-    <w:p>
-      <w:r>
-        <w:br w:type="page"/>
-      </w:r>
-    </w:p>
     <w:bookmarkEnd w:id="25"/>
     <w:bookmarkStart w:id="26" w:name="preface"/>
     <w:p>
@@ -937,11 +917,6 @@
         <w:t xml:space="preserve">Samuel Omobusuyi</w:t>
       </w:r>
     </w:p>
-    <w:p>
-      <w:r>
-        <w:br w:type="page"/>
-      </w:r>
-    </w:p>
     <w:bookmarkEnd w:id="26"/>
     <w:bookmarkStart w:id="33" w:name="how-to-use-this-book"/>
     <w:p>
@@ -1073,11 +1048,6 @@
       </w:pPr>
       <w:r>
         <w:t xml:space="preserve">Once you've read Parts One through Three, Module 14 compresses the whole framework into a thirty-day rollout: what to install in your business each week, in what order, with what you should expect to see change by day thirty. That's the chapter to return to once you've finished the book and want to actually build the system, rather than just understand it.</w:t>
-      </w:r>
-    </w:p>
-    <w:p>
-      <w:r>
-        <w:br w:type="page"/>
       </w:r>
     </w:p>
     <w:bookmarkEnd w:id="32"/>
@@ -1224,11 +1194,6 @@
         <w:t xml:space="preserve">The deal you're about to lose, or the one you're about to win, is probably decided by which of the nine stages you handle next. Let's start with the one most sellers get wrong before they've said a single word to the prospect: trust.</w:t>
       </w:r>
     </w:p>
-    <w:p>
-      <w:r>
-        <w:br w:type="page"/>
-      </w:r>
-    </w:p>
     <w:bookmarkEnd w:id="36"/>
     <w:bookmarkEnd w:id="37"/>
     <w:bookmarkStart w:id="44" w:name="the-blueprint-framework"/>
@@ -1255,7 +1220,7 @@
       <w:r>
         <w:drawing>
           <wp:inline>
-            <wp:extent cx="4013200" cy="2206236"/>
+            <wp:extent cx="3931919" cy="2161552"/>
             <wp:effectExtent b="0" l="0" r="0" t="0"/>
             <wp:docPr descr="Figure 0.1: The Blueprint Framework, the nine stages a buyer moves through on the way to a decision." title="" id="39" name="Picture"/>
             <a:graphic>
@@ -1276,7 +1241,7 @@
                   <pic:spPr bwMode="auto">
                     <a:xfrm>
                       <a:off x="0" y="0"/>
-                      <a:ext cx="4013200" cy="2206236"/>
+                      <a:ext cx="3931919" cy="2161552"/>
                     </a:xfrm>
                     <a:prstGeom prst="rect">
                       <a:avLst/>
@@ -1601,11 +1566,6 @@
         <w:t xml:space="preserve">Part Two starts with the stage most sellers try to skip entirely, assuming a strong product will cover for it. It won't.</w:t>
       </w:r>
     </w:p>
-    <w:p>
-      <w:r>
-        <w:br w:type="page"/>
-      </w:r>
-    </w:p>
     <w:bookmarkEnd w:id="43"/>
     <w:bookmarkEnd w:id="44"/>
     <w:bookmarkStart w:id="45" w:name="part-one-foundations"/>
@@ -1615,11 +1575,6 @@
       </w:pPr>
       <w:r>
         <w:t xml:space="preserve">Part One: Foundations</w:t>
-      </w:r>
-    </w:p>
-    <w:p>
-      <w:r>
-        <w:br w:type="page"/>
       </w:r>
     </w:p>
     <w:bookmarkEnd w:id="45"/>
@@ -2136,7 +2091,7 @@
       <w:r>
         <w:drawing>
           <wp:inline>
-            <wp:extent cx="4013200" cy="6150098"/>
+            <wp:extent cx="3758184" cy="5759294"/>
             <wp:effectExtent b="0" l="0" r="0" t="0"/>
             <wp:docPr descr="Figure 1.1: Two sellers, same deal. The personality-led approach and the sequence-led approach both start from an identical opening pitch; they diverge at the first unaddressed doubt, and only one path reaches a close." title="" id="54" name="Picture"/>
             <a:graphic>
@@ -2157,7 +2112,7 @@
                   <pic:spPr bwMode="auto">
                     <a:xfrm>
                       <a:off x="0" y="0"/>
-                      <a:ext cx="4013200" cy="6150098"/>
+                      <a:ext cx="3758184" cy="5759294"/>
                     </a:xfrm>
                     <a:prstGeom prst="rect">
                       <a:avLst/>
@@ -2454,11 +2409,6 @@
         <w:t xml:space="preserve">The deal you lost was decided long before the price was ever discussed.</w:t>
       </w:r>
     </w:p>
-    <w:p>
-      <w:r>
-        <w:br w:type="page"/>
-      </w:r>
-    </w:p>
     <w:bookmarkEnd w:id="63"/>
     <w:bookmarkEnd w:id="64"/>
     <w:bookmarkStart w:id="84" w:name="module-2-how-customers-really-buy"/>
@@ -2728,7 +2678,7 @@
       <w:r>
         <w:drawing>
           <wp:inline>
-            <wp:extent cx="4013200" cy="1678991"/>
+            <wp:extent cx="3931919" cy="1644986"/>
             <wp:effectExtent b="0" l="0" r="0" t="0"/>
             <wp:docPr descr="Figure 2.1: The hidden committee. Three roles, three separate concerns, one decision. A pitch aimed at only one role leaves the others unaddressed." title="" id="73" name="Picture"/>
             <a:graphic>
@@ -2749,7 +2699,7 @@
                   <pic:spPr bwMode="auto">
                     <a:xfrm>
                       <a:off x="0" y="0"/>
-                      <a:ext cx="4013200" cy="1678991"/>
+                      <a:ext cx="3931919" cy="1644986"/>
                     </a:xfrm>
                     <a:prstGeom prst="rect">
                       <a:avLst/>
@@ -3236,11 +3186,6 @@
         <w:t xml:space="preserve">You are never selling to one person; you are selling to everyone who can say no.</w:t>
       </w:r>
     </w:p>
-    <w:p>
-      <w:r>
-        <w:br w:type="page"/>
-      </w:r>
-    </w:p>
     <w:bookmarkEnd w:id="83"/>
     <w:bookmarkEnd w:id="84"/>
     <w:bookmarkStart w:id="85" w:name="part-two-the-blueprint-framework"/>
@@ -3250,11 +3195,6 @@
       </w:pPr>
       <w:r>
         <w:t xml:space="preserve">Part Two: The Blueprint Framework</w:t>
-      </w:r>
-    </w:p>
-    <w:p>
-      <w:r>
-        <w:br w:type="page"/>
       </w:r>
     </w:p>
     <w:bookmarkEnd w:id="85"/>
@@ -3719,7 +3659,7 @@
       <w:r>
         <w:drawing>
           <wp:inline>
-            <wp:extent cx="4013200" cy="7648344"/>
+            <wp:extent cx="3026664" cy="5768207"/>
             <wp:effectExtent b="0" l="0" r="0" t="0"/>
             <wp:docPr descr="Figure 3.1: The Trust Pyramid. Competence and reliability signals form the base; candour sits above them, because admitting a limitation only builds trust once the buyer already believes you're capable and dependable. Trust granted sits at the apex, not the start." title="" id="94" name="Picture"/>
             <a:graphic>
@@ -3740,7 +3680,7 @@
                   <pic:spPr bwMode="auto">
                     <a:xfrm>
                       <a:off x="0" y="0"/>
-                      <a:ext cx="4013200" cy="7648344"/>
+                      <a:ext cx="3026664" cy="5768207"/>
                     </a:xfrm>
                     <a:prstGeom prst="rect">
                       <a:avLst/>
@@ -4039,11 +3979,6 @@
         <w:t xml:space="preserve">Trust is not something you ask for; it's something you demonstrate before you ask for anything else.</w:t>
       </w:r>
     </w:p>
-    <w:p>
-      <w:r>
-        <w:br w:type="page"/>
-      </w:r>
-    </w:p>
     <w:bookmarkEnd w:id="104"/>
     <w:bookmarkEnd w:id="105"/>
     <w:bookmarkStart w:id="124" w:name="module-4-learn-the-customer"/>
@@ -4501,7 +4436,7 @@
       <w:r>
         <w:drawing>
           <wp:inline>
-            <wp:extent cx="4013200" cy="2398559"/>
+            <wp:extent cx="3931919" cy="2349981"/>
             <wp:effectExtent b="0" l="0" r="0" t="0"/>
             <wp:docPr descr="Figure 4.1: The Customer Journey. What Priya learned about Dominic maps onto four stages of his own journey toward a decision: aware of the problem, evaluating options, deciding internally, and justifying the choice afterward. Each stage needs different information from him, which is why one long discovery conversation rarely captures it all." title="" id="113" name="Picture"/>
             <a:graphic>
@@ -4522,7 +4457,7 @@
                   <pic:spPr bwMode="auto">
                     <a:xfrm>
                       <a:off x="0" y="0"/>
-                      <a:ext cx="4013200" cy="2398559"/>
+                      <a:ext cx="3931919" cy="2349981"/>
                     </a:xfrm>
                     <a:prstGeom prst="rect">
                       <a:avLst/>
@@ -4821,11 +4756,6 @@
         <w:t xml:space="preserve">You cannot diagnose a problem you never asked the right questions about.</w:t>
       </w:r>
     </w:p>
-    <w:p>
-      <w:r>
-        <w:br w:type="page"/>
-      </w:r>
-    </w:p>
     <w:bookmarkEnd w:id="123"/>
     <w:bookmarkEnd w:id="124"/>
     <w:bookmarkStart w:id="144" w:name="module-5-understand-the-problem"/>
@@ -5257,7 +5187,7 @@
       <w:r>
         <w:drawing>
           <wp:inline>
-            <wp:extent cx="4013200" cy="2421006"/>
+            <wp:extent cx="3931919" cy="2371973"/>
             <wp:effectExtent b="0" l="0" r="0" t="0"/>
             <wp:docPr descr="Figure 5.1: The Buying Psychology Wheel. A buyer's stated problem is usually a mix of four forces: the immediate irritation, the quantifiable cost of leaving it unsolved, the risk of getting a fix wrong, and what success would actually feel like. Missing any one of the four means an incomplete diagnosis." title="" id="134" name="Picture"/>
             <a:graphic>
@@ -5278,7 +5208,7 @@
                   <pic:spPr bwMode="auto">
                     <a:xfrm>
                       <a:off x="0" y="0"/>
-                      <a:ext cx="4013200" cy="2421006"/>
+                      <a:ext cx="3931919" cy="2371973"/>
                     </a:xfrm>
                     <a:prstGeom prst="rect">
                       <a:avLst/>
@@ -5571,11 +5501,6 @@
         <w:t xml:space="preserve">The problem the buyer describes first is rarely the one worth solving.</w:t>
       </w:r>
     </w:p>
-    <w:p>
-      <w:r>
-        <w:br w:type="page"/>
-      </w:r>
-    </w:p>
     <w:bookmarkEnd w:id="143"/>
     <w:bookmarkEnd w:id="144"/>
     <w:bookmarkStart w:id="164" w:name="module-6-establish-value"/>
@@ -5989,7 +5914,7 @@
       <w:r>
         <w:drawing>
           <wp:inline>
-            <wp:extent cx="4013200" cy="8695266"/>
+            <wp:extent cx="2660904" cy="5765292"/>
             <wp:effectExtent b="0" l="0" r="0" t="0"/>
             <wp:docPr descr="Figure 6.1: The Value Stack. Each layer is a distinct, buyer-confirmed outcome. The price sits at the bottom, visually smaller than the pile of value stacked above it." title="" id="153" name="Picture"/>
             <a:graphic>
@@ -6010,7 +5935,7 @@
                   <pic:spPr bwMode="auto">
                     <a:xfrm>
                       <a:off x="0" y="0"/>
-                      <a:ext cx="4013200" cy="8695266"/>
+                      <a:ext cx="2660904" cy="5765292"/>
                     </a:xfrm>
                     <a:prstGeom prst="rect">
                       <a:avLst/>
@@ -6321,11 +6246,6 @@
         <w:t xml:space="preserve">Value isn't what you claim; it's what the buyer can check against what they already told you.</w:t>
       </w:r>
     </w:p>
-    <w:p>
-      <w:r>
-        <w:br w:type="page"/>
-      </w:r>
-    </w:p>
     <w:bookmarkEnd w:id="163"/>
     <w:bookmarkEnd w:id="164"/>
     <w:bookmarkStart w:id="187" w:name="module-7-present-the-offer"/>
@@ -6713,7 +6633,7 @@
       <w:r>
         <w:drawing>
           <wp:inline>
-            <wp:extent cx="4013200" cy="2538963"/>
+            <wp:extent cx="3931919" cy="2487541"/>
             <wp:effectExtent b="0" l="0" r="0" t="0"/>
             <wp:docPr descr="Figure 7.1: The Offer Builder. A well-built offer has four parts in a fixed order: the recommended package, what's included, what counts as a variation, and one clear next step." title="" id="172" name="Picture"/>
             <a:graphic>
@@ -6734,7 +6654,7 @@
                   <pic:spPr bwMode="auto">
                     <a:xfrm>
                       <a:off x="0" y="0"/>
-                      <a:ext cx="4013200" cy="2538963"/>
+                      <a:ext cx="3931919" cy="2487541"/>
                     </a:xfrm>
                     <a:prstGeom prst="rect">
                       <a:avLst/>
@@ -6794,7 +6714,7 @@
       <w:r>
         <w:drawing>
           <wp:inline>
-            <wp:extent cx="4013200" cy="6136124"/>
+            <wp:extent cx="3767328" cy="5760189"/>
             <wp:effectExtent b="0" l="0" r="0" t="0"/>
             <wp:docPr descr="Figure 7.2: The Pricing Ladder. Three tiers, one clearly anchored as the recommendation. A ladder, not a menu of equals." title="" id="176" name="Picture"/>
             <a:graphic>
@@ -6815,7 +6735,7 @@
                   <pic:spPr bwMode="auto">
                     <a:xfrm>
                       <a:off x="0" y="0"/>
-                      <a:ext cx="4013200" cy="6136124"/>
+                      <a:ext cx="3767328" cy="5760189"/>
                     </a:xfrm>
                     <a:prstGeom prst="rect">
                       <a:avLst/>
@@ -7126,11 +7046,6 @@
         <w:t xml:space="preserve">An offer should be easy to say yes to, not merely accurate.</w:t>
       </w:r>
     </w:p>
-    <w:p>
-      <w:r>
-        <w:br w:type="page"/>
-      </w:r>
-    </w:p>
     <w:bookmarkEnd w:id="186"/>
     <w:bookmarkEnd w:id="187"/>
     <w:bookmarkStart w:id="210" w:name="module-8-remove-doubt"/>
@@ -7334,7 +7249,7 @@
       <w:r>
         <w:drawing>
           <wp:inline>
-            <wp:extent cx="4013200" cy="5372394"/>
+            <wp:extent cx="3931919" cy="5263586"/>
             <wp:effectExtent b="0" l="0" r="0" t="0"/>
             <wp:docPr descr="Figure 8.1: The Objection Flowchart. When a buyer hesitates, ask what specifically is behind it before responding. A specific answer gets a specific resolution; a vague answer signals an earlier stage needs revisiting." title="" id="193" name="Picture"/>
             <a:graphic>
@@ -7355,7 +7270,7 @@
                   <pic:spPr bwMode="auto">
                     <a:xfrm>
                       <a:off x="0" y="0"/>
-                      <a:ext cx="4013200" cy="5372394"/>
+                      <a:ext cx="3931919" cy="5263586"/>
                     </a:xfrm>
                     <a:prstGeom prst="rect">
                       <a:avLst/>
@@ -7407,7 +7322,7 @@
       <w:r>
         <w:drawing>
           <wp:inline>
-            <wp:extent cx="4013200" cy="1249006"/>
+            <wp:extent cx="3931919" cy="1223709"/>
             <wp:effectExtent b="0" l="0" r="0" t="0"/>
             <wp:docPr descr="Figure 8.2: The Decision Tree. Once the specific doubt is named, it usually sorts into one of a small number of categories (timing, budget, trust in delivery, internal buy-in), each with its own kind of resolution." title="" id="197" name="Picture"/>
             <a:graphic>
@@ -7428,7 +7343,7 @@
                   <pic:spPr bwMode="auto">
                     <a:xfrm>
                       <a:off x="0" y="0"/>
-                      <a:ext cx="4013200" cy="1249006"/>
+                      <a:ext cx="3931919" cy="1223709"/>
                     </a:xfrm>
                     <a:prstGeom prst="rect">
                       <a:avLst/>
@@ -7935,11 +7850,6 @@
         <w:t xml:space="preserve">Every objection is a question in disguise; answer the question, not the disguise.</w:t>
       </w:r>
     </w:p>
-    <w:p>
-      <w:r>
-        <w:br w:type="page"/>
-      </w:r>
-    </w:p>
     <w:bookmarkEnd w:id="209"/>
     <w:bookmarkEnd w:id="210"/>
     <w:bookmarkStart w:id="230" w:name="module-9-inspire-action"/>
@@ -8125,7 +8035,7 @@
       <w:r>
         <w:drawing>
           <wp:inline>
-            <wp:extent cx="4013200" cy="5438176"/>
+            <wp:extent cx="3931919" cy="5328036"/>
             <wp:effectExtent b="0" l="0" r="0" t="0"/>
             <wp:docPr descr="Figure 9.1: The Sales Funnel. Interest and agreement are wide; committed action is the narrowest point. Most deals that stall do so at exactly that narrowing, not earlier." title="" id="215" name="Picture"/>
             <a:graphic>
@@ -8146,7 +8056,7 @@
                   <pic:spPr bwMode="auto">
                     <a:xfrm>
                       <a:off x="0" y="0"/>
-                      <a:ext cx="4013200" cy="5438176"/>
+                      <a:ext cx="3931919" cy="5328036"/>
                     </a:xfrm>
                     <a:prstGeom prst="rect">
                       <a:avLst/>
@@ -8689,11 +8599,6 @@
         <w:t xml:space="preserve">A convinced buyer who hasn't acted doesn't need more persuading; they need a smaller next step.</w:t>
       </w:r>
     </w:p>
-    <w:p>
-      <w:r>
-        <w:br w:type="page"/>
-      </w:r>
-    </w:p>
     <w:bookmarkEnd w:id="229"/>
     <w:bookmarkEnd w:id="230"/>
     <w:bookmarkStart w:id="249" w:name="module-10-nurture-relationships"/>
@@ -8889,7 +8794,7 @@
       <w:r>
         <w:drawing>
           <wp:inline>
-            <wp:extent cx="4013200" cy="2398559"/>
+            <wp:extent cx="3931919" cy="2349981"/>
             <wp:effectExtent b="0" l="0" r="0" t="0"/>
             <wp:docPr descr="Figure 10.1: The Follow-up Timeline. A handful of deliberate touchpoints, each with its own honest purpose, spaced out from delivery onward. None of them exists to sell something." title="" id="236" name="Picture"/>
             <a:graphic>
@@ -8910,7 +8815,7 @@
                   <pic:spPr bwMode="auto">
                     <a:xfrm>
                       <a:off x="0" y="0"/>
-                      <a:ext cx="4013200" cy="2398559"/>
+                      <a:ext cx="3931919" cy="2349981"/>
                     </a:xfrm>
                     <a:prstGeom prst="rect">
                       <a:avLst/>
@@ -9474,11 +9379,6 @@
         <w:t xml:space="preserve">The invoice being paid is the start of the relationship's value, not the end of the transaction that produced it.</w:t>
       </w:r>
     </w:p>
-    <w:p>
-      <w:r>
-        <w:br w:type="page"/>
-      </w:r>
-    </w:p>
     <w:bookmarkEnd w:id="248"/>
     <w:bookmarkEnd w:id="249"/>
     <w:bookmarkStart w:id="273" w:name="module-11-turn-customers-into-advocates"/>
@@ -9682,7 +9582,7 @@
       <w:r>
         <w:drawing>
           <wp:inline>
-            <wp:extent cx="4013200" cy="2538963"/>
+            <wp:extent cx="3931919" cy="2487541"/>
             <wp:effectExtent b="0" l="0" r="0" t="0"/>
             <wp:docPr descr="Figure 11.1: The Referral Flywheel. Deliver a confirmed win, ask specifically at the moment proof lands, make the ask easy to say yes to, then close the loop, which is what makes the next revolution of the flywheel easier than the last." title="" id="255" name="Picture"/>
             <a:graphic>
@@ -9703,7 +9603,7 @@
                   <pic:spPr bwMode="auto">
                     <a:xfrm>
                       <a:off x="0" y="0"/>
-                      <a:ext cx="4013200" cy="2538963"/>
+                      <a:ext cx="3931919" cy="2487541"/>
                     </a:xfrm>
                     <a:prstGeom prst="rect">
                       <a:avLst/>
@@ -9969,7 +9869,7 @@
       <w:r>
         <w:drawing>
           <wp:inline>
-            <wp:extent cx="4013200" cy="2866571"/>
+            <wp:extent cx="3931919" cy="2808514"/>
             <wp:effectExtent b="0" l="0" r="0" t="0"/>
             <wp:docPr descr="Figure 11.2: Customer Lifetime Value. A single transaction produces one flat line of value. A nurtured, systematically-asked relationship compounds, because referrals bring new customers who can themselves become advocates." title="" id="262" name="Picture"/>
             <a:graphic>
@@ -9990,7 +9890,7 @@
                   <pic:spPr bwMode="auto">
                     <a:xfrm>
                       <a:off x="0" y="0"/>
-                      <a:ext cx="4013200" cy="2866571"/>
+                      <a:ext cx="3931919" cy="2808514"/>
                     </a:xfrm>
                     <a:prstGeom prst="rect">
                       <a:avLst/>
@@ -10301,11 +10201,6 @@
         <w:t xml:space="preserve">A referral you asked for specifically is a system; a referral you merely hoped for is luck.</w:t>
       </w:r>
     </w:p>
-    <w:p>
-      <w:r>
-        <w:br w:type="page"/>
-      </w:r>
-    </w:p>
     <w:bookmarkEnd w:id="272"/>
     <w:bookmarkEnd w:id="273"/>
     <w:bookmarkStart w:id="274" w:name="part-three-modern-selling"/>
@@ -10317,11 +10212,6 @@
         <w:t xml:space="preserve">Part Three: Modern Selling</w:t>
       </w:r>
     </w:p>
-    <w:p>
-      <w:r>
-        <w:br w:type="page"/>
-      </w:r>
-    </w:p>
     <w:bookmarkEnd w:id="274"/>
     <w:bookmarkStart w:id="295" w:name="module-12-digital-selling"/>
     <w:p>
@@ -10500,7 +10390,7 @@
       <w:r>
         <w:drawing>
           <wp:inline>
-            <wp:extent cx="4013200" cy="2809240"/>
+            <wp:extent cx="3931919" cy="2752343"/>
             <wp:effectExtent b="0" l="0" r="0" t="0"/>
             <wp:docPr descr="Figure 12.1: Digital Trust and Discovery Signals. Each in-person signal from Modules 3 and 4 has a digital equivalent; asking directly replaces reading the room." title="" id="280" name="Picture"/>
             <a:graphic>
@@ -10521,7 +10411,7 @@
                   <pic:spPr bwMode="auto">
                     <a:xfrm>
                       <a:off x="0" y="0"/>
-                      <a:ext cx="4013200" cy="2809240"/>
+                      <a:ext cx="3931919" cy="2752343"/>
                     </a:xfrm>
                     <a:prstGeom prst="rect">
                       <a:avLst/>
@@ -11076,11 +10966,6 @@
         <w:t xml:space="preserve">Digital selling doesn't change the sequence; it removes the cues that used to carry some of the weight, so you have to carry it in words instead.</w:t>
       </w:r>
     </w:p>
-    <w:p>
-      <w:r>
-        <w:br w:type="page"/>
-      </w:r>
-    </w:p>
     <w:bookmarkEnd w:id="294"/>
     <w:bookmarkEnd w:id="295"/>
     <w:bookmarkStart w:id="318" w:name="module-13-sales-systems"/>
@@ -11232,7 +11117,7 @@
       <w:r>
         <w:drawing>
           <wp:inline>
-            <wp:extent cx="4013200" cy="3884138"/>
+            <wp:extent cx="3931919" cy="3805472"/>
             <wp:effectExtent b="0" l="0" r="0" t="0"/>
             <wp:docPr descr="Figure 13.1: The Lead Pipeline. Every open deal sits under its actual Blueprint stage, which tells you the next specific action, not just how far along it is." title="" id="299" name="Picture"/>
             <a:graphic>
@@ -11253,7 +11138,7 @@
                   <pic:spPr bwMode="auto">
                     <a:xfrm>
                       <a:off x="0" y="0"/>
-                      <a:ext cx="4013200" cy="3884138"/>
+                      <a:ext cx="3931919" cy="3805472"/>
                     </a:xfrm>
                     <a:prstGeom prst="rect">
                       <a:avLst/>
@@ -11568,7 +11453,7 @@
       <w:r>
         <w:drawing>
           <wp:inline>
-            <wp:extent cx="4013200" cy="2866571"/>
+            <wp:extent cx="3931919" cy="2808514"/>
             <wp:effectExtent b="0" l="0" r="0" t="0"/>
             <wp:docPr descr="Figure 13.2: The Sales Dashboard. Win rate and referral rate, tracked monthly, are the two numbers that most directly reflect whether the framework's earlier stages are being run well." title="" id="306" name="Picture"/>
             <a:graphic>
@@ -11589,7 +11474,7 @@
                   <pic:spPr bwMode="auto">
                     <a:xfrm>
                       <a:off x="0" y="0"/>
-                      <a:ext cx="4013200" cy="2866571"/>
+                      <a:ext cx="3931919" cy="2808514"/>
                     </a:xfrm>
                     <a:prstGeom prst="rect">
                       <a:avLst/>
@@ -11926,11 +11811,6 @@
         <w:t xml:space="preserve">A system is a framework that survives having more than one deal on your desk at once.</w:t>
       </w:r>
     </w:p>
-    <w:p>
-      <w:r>
-        <w:br w:type="page"/>
-      </w:r>
-    </w:p>
     <w:bookmarkEnd w:id="317"/>
     <w:bookmarkEnd w:id="318"/>
     <w:bookmarkStart w:id="319" w:name="part-four-implementation"/>
@@ -11942,11 +11822,6 @@
         <w:t xml:space="preserve">Part Four: Implementation</w:t>
       </w:r>
     </w:p>
-    <w:p>
-      <w:r>
-        <w:br w:type="page"/>
-      </w:r>
-    </w:p>
     <w:bookmarkEnd w:id="319"/>
     <w:bookmarkStart w:id="339" w:name="module-14-the-30-day-sales-blueprint"/>
     <w:p>
@@ -12151,7 +12026,7 @@
       <w:r>
         <w:drawing>
           <wp:inline>
-            <wp:extent cx="4013200" cy="9044240"/>
+            <wp:extent cx="2560320" cy="5769996"/>
             <wp:effectExtent b="0" l="0" r="0" t="0"/>
             <wp:docPr descr="Figure 14.1: The 30-Day Rollout. Four weeks, two or three stages installed at a time, each building on the trust and diagnosis established in the week before." title="" id="326" name="Picture"/>
             <a:graphic>
@@ -12172,7 +12047,7 @@
                   <pic:spPr bwMode="auto">
                     <a:xfrm>
                       <a:off x="0" y="0"/>
-                      <a:ext cx="4013200" cy="9044240"/>
+                      <a:ext cx="2560320" cy="5769996"/>
                     </a:xfrm>
                     <a:prstGeom prst="rect">
                       <a:avLst/>
@@ -12786,11 +12661,6 @@
         <w:t xml:space="preserve">You don't need to master nine stages at once; you need thirty days to install them one week at a time.</w:t>
       </w:r>
     </w:p>
-    <w:p>
-      <w:r>
-        <w:br w:type="page"/>
-      </w:r>
-    </w:p>
     <w:bookmarkEnd w:id="338"/>
     <w:bookmarkEnd w:id="339"/>
     <w:bookmarkStart w:id="340" w:name="appendices"/>
@@ -12800,11 +12670,6 @@
       </w:pPr>
       <w:r>
         <w:t xml:space="preserve">Appendices</w:t>
-      </w:r>
-    </w:p>
-    <w:p>
-      <w:r>
-        <w:br w:type="page"/>
       </w:r>
     </w:p>
     <w:bookmarkEnd w:id="340"/>
@@ -13600,11 +13465,6 @@
         <w:t xml:space="preserve">Use them in order the first time through the book; after that, open whichever one matches the stage your current deal is actually at.</w:t>
       </w:r>
     </w:p>
-    <w:p>
-      <w:r>
-        <w:br w:type="page"/>
-      </w:r>
-    </w:p>
     <w:bookmarkEnd w:id="341"/>
     <w:bookmarkStart w:id="342" w:name="appendix-templates"/>
     <w:p>
@@ -13799,11 +13659,6 @@
         <w:t xml:space="preserve">Adapt the wording in every template to how you actually talk. A template that reads like a corporate memo undoes the trust Module 3 spent effort building.</w:t>
       </w:r>
     </w:p>
-    <w:p>
-      <w:r>
-        <w:br w:type="page"/>
-      </w:r>
-    </w:p>
     <w:bookmarkEnd w:id="342"/>
     <w:bookmarkStart w:id="343" w:name="appendix-checklists"/>
     <w:p>
@@ -13922,11 +13777,6 @@
         <w:t xml:space="preserve">Use the checklist to track progress once you've planned your rollout with the corresponding worksheet; use the worksheet when you need to think something through, not just tick it off.</w:t>
       </w:r>
     </w:p>
-    <w:p>
-      <w:r>
-        <w:br w:type="page"/>
-      </w:r>
-    </w:p>
     <w:bookmarkEnd w:id="343"/>
     <w:bookmarkStart w:id="344" w:name="glossary"/>
     <w:p>
@@ -14393,11 +14243,6 @@
       </w:r>
       <w:r>
         <w:t xml:space="preserve">Specific, checkable evidence, of competence, reliability, or candour, that earns a buyer's willingness to take what a seller says at face value. See Module 3.</w:t>
-      </w:r>
-    </w:p>
-    <w:p>
-      <w:r>
-        <w:br w:type="page"/>
       </w:r>
     </w:p>
     <w:bookmarkEnd w:id="344"/>
@@ -15158,11 +15003,6 @@
         <w:t xml:space="preserve">When a deal stalls anywhere in the sequence, this table is usually the fastest way to spot which question was never actually answered.</w:t>
       </w:r>
     </w:p>
-    <w:p>
-      <w:r>
-        <w:br w:type="page"/>
-      </w:r>
-    </w:p>
     <w:bookmarkEnd w:id="345"/>
     <w:bookmarkEnd w:id="346"/>
     <w:bookmarkStart w:id="348" w:name="references"/>
@@ -15295,11 +15135,6 @@
         <w:t xml:space="preserve">Each takes a different angle on persuasion and selling than this book does; reading them alongside the Blueprint Framework will show you where the ideas agree, and where they don't.</w:t>
       </w:r>
     </w:p>
-    <w:p>
-      <w:r>
-        <w:br w:type="page"/>
-      </w:r>
-    </w:p>
     <w:bookmarkEnd w:id="347"/>
     <w:bookmarkEnd w:id="348"/>
     <w:bookmarkStart w:id="350" w:name="worksheets"/>
@@ -15320,11 +15155,6 @@
         <w:t xml:space="preserve">All fourteen, in full</w:t>
       </w:r>
     </w:p>
-    <w:p>
-      <w:r>
-        <w:br w:type="page"/>
-      </w:r>
-    </w:p>
     <w:bookmarkEnd w:id="349"/>
     <w:bookmarkEnd w:id="350"/>
     <w:bookmarkStart w:id="358" w:name="worksheet-1-myth-audit"/>
@@ -15515,11 +15345,6 @@
       </w:pPr>
       <w:r>
         <w:t xml:space="preserve">In one honest sentence, what did believing this myth protect you from admitting? (For example: "believing my product should speak for itself let me avoid the discomfort of asking directly for the sale.") You don't need to share this with anyone. Naming it is what makes it easier to catch next time.</w:t>
-      </w:r>
-    </w:p>
-    <w:p>
-      <w:r>
-        <w:br w:type="page"/>
       </w:r>
     </w:p>
     <w:bookmarkEnd w:id="357"/>
@@ -15798,11 +15623,6 @@
         <w:t xml:space="preserve">Estimate how large this committee is likely to grow, based on how much this decision costs the business and how hard it would be to reverse, not based on how big the company is. If the answer is "probably bigger than the two or three people I've already met," plan your next meeting around finding out who's missing.</w:t>
       </w:r>
     </w:p>
-    <w:p>
-      <w:r>
-        <w:br w:type="page"/>
-      </w:r>
-    </w:p>
     <w:bookmarkEnd w:id="365"/>
     <w:bookmarkEnd w:id="366"/>
     <w:bookmarkStart w:id="373" w:name="worksheet-3-trust-audit"/>
@@ -16070,11 +15890,6 @@
       </w:pPr>
       <w:r>
         <w:t xml:space="preserve">Trust built in this meeting isn't permanent. Decide now how you'll handle it if something on your side slips later in this deal (a late reply, a missed date): what you'll say, how quickly, and what specific fix you'll offer. Deciding this in advance means you won't improvise it badly under pressure later.</w:t>
-      </w:r>
-    </w:p>
-    <w:p>
-      <w:r>
-        <w:br w:type="page"/>
       </w:r>
     </w:p>
     <w:bookmarkEnd w:id="372"/>
@@ -16452,11 +16267,6 @@
         <w:t xml:space="preserve">If a new person joins this deal after today, note their name here and mark that Steps 1 to 3 need to be repeated for them specifically. Do not assume their answers will match the stakeholder you already spoke to.</w:t>
       </w:r>
     </w:p>
-    <w:p>
-      <w:r>
-        <w:br w:type="page"/>
-      </w:r>
-    </w:p>
     <w:bookmarkEnd w:id="379"/>
     <w:bookmarkEnd w:id="380"/>
     <w:bookmarkStart w:id="389" w:name="worksheet-5-problem-diagnosis"/>
@@ -16633,11 +16443,6 @@
       </w:pPr>
       <w:r>
         <w:t xml:space="preserve">Honestly: did your follow-up question actually change the shape of the solution, or did it just confirm what the buyer told you the first time? If nothing changed, the first answer was likely already correct. Don't manufacture complexity that isn't there.</w:t>
-      </w:r>
-    </w:p>
-    <w:p>
-      <w:r>
-        <w:br w:type="page"/>
       </w:r>
     </w:p>
     <w:bookmarkEnd w:id="388"/>
@@ -16877,11 +16682,6 @@
       </w:pPr>
       <w:r>
         <w:t xml:space="preserve">Re-read your full stack. Is every item genuinely distinct, or does one just restate another to make the pile look bigger? Remove any item that doesn't survive this check, even if it leaves you with only two.</w:t>
-      </w:r>
-    </w:p>
-    <w:p>
-      <w:r>
-        <w:br w:type="page"/>
       </w:r>
     </w:p>
     <w:bookmarkEnd w:id="396"/>
@@ -17172,11 +16972,6 @@
         <w:t xml:space="preserve">If this buyer's process mandates more than one priced option, write the exact sentence you'll include stating which one you recommend and why, tied to their confirmed problem. Do not leave the document neutral.</w:t>
       </w:r>
     </w:p>
-    <w:p>
-      <w:r>
-        <w:br w:type="page"/>
-      </w:r>
-    </w:p>
     <w:bookmarkEnd w:id="404"/>
     <w:bookmarkEnd w:id="405"/>
     <w:bookmarkStart w:id="413" w:name="worksheet-8-objection-resolution"/>
@@ -17361,11 +17156,6 @@
         <w:t xml:space="preserve">If, in building the resolution in Step 5, you realise the concern is actually true and you cannot honestly fix it, write down the plain, honest sentence you'll use to name the trade-off to the buyer instead of forcing a resolution that won't hold up.</w:t>
       </w:r>
     </w:p>
-    <w:p>
-      <w:r>
-        <w:br w:type="page"/>
-      </w:r>
-    </w:p>
     <w:bookmarkEnd w:id="412"/>
     <w:bookmarkEnd w:id="413"/>
     <w:bookmarkStart w:id="421" w:name="worksheet-9-action-friction-audit"/>
@@ -17536,11 +17326,6 @@
       </w:pPr>
       <w:r>
         <w:t xml:space="preserve">Log how many times you've followed up on this specific ask. If you're past one honest follow-up with no new information to add, stop repeating it and instead ask directly whether anything has changed.</w:t>
-      </w:r>
-    </w:p>
-    <w:p>
-      <w:r>
-        <w:br w:type="page"/>
       </w:r>
     </w:p>
     <w:bookmarkEnd w:id="420"/>
@@ -17813,11 +17598,6 @@
         <w:t xml:space="preserve">If you have more than a handful of customers, set calendar reminders for the timing in Step 2 across all of them. Keep the reminder generic ("check in with [name] about [what they bought]"); write the actual message specific to that customer each time you send it.</w:t>
       </w:r>
     </w:p>
-    <w:p>
-      <w:r>
-        <w:br w:type="page"/>
-      </w:r>
-    </w:p>
     <w:bookmarkEnd w:id="427"/>
     <w:bookmarkEnd w:id="428"/>
     <w:bookmarkStart w:id="436" w:name="worksheet-11-referral-ask-builder"/>
@@ -17960,11 +17740,6 @@
       </w:pPr>
       <w:r>
         <w:t xml:space="preserve">Before you ask this customer again in future, check: is this ask driven by something they mentioned unprompted, or by your own need for a new lead? If it's the latter, wait for a genuine opening instead.</w:t>
-      </w:r>
-    </w:p>
-    <w:p>
-      <w:r>
-        <w:br w:type="page"/>
       </w:r>
     </w:p>
     <w:bookmarkEnd w:id="435"/>
@@ -18267,11 +18042,6 @@
         <w:t xml:space="preserve">If this deal closes, write down the specific, genuine check-in you'll send at six weeks, exactly as you would for an in-person customer. Note which channel suits it best.</w:t>
       </w:r>
     </w:p>
-    <w:p>
-      <w:r>
-        <w:br w:type="page"/>
-      </w:r>
-    </w:p>
     <w:bookmarkEnd w:id="443"/>
     <w:bookmarkEnd w:id="444"/>
     <w:bookmarkStart w:id="452" w:name="worksheet-13-pipeline-rebuild"/>
@@ -18522,11 +18292,6 @@
         <w:t xml:space="preserve">If anyone else is or will be involved in selling, confirm they can look at this board and know the next action for any deal on it, without asking you to explain it first.</w:t>
       </w:r>
     </w:p>
-    <w:p>
-      <w:r>
-        <w:br w:type="page"/>
-      </w:r>
-    </w:p>
     <w:bookmarkEnd w:id="451"/>
     <w:bookmarkEnd w:id="452"/>
     <w:bookmarkStart w:id="460" w:name="worksheet-14-30-day-rollout-planner"/>
@@ -18863,11 +18628,6 @@
         <w:t xml:space="preserve">Note here which week, and why (no advanced deal to work with, an unexpected crisis, something else). Repeat that week using whatever live deal is available before moving on to the next one, even if it means your rollout takes five or six weeks instead of four.</w:t>
       </w:r>
     </w:p>
-    <w:p>
-      <w:r>
-        <w:br w:type="page"/>
-      </w:r>
-    </w:p>
     <w:bookmarkEnd w:id="459"/>
     <w:bookmarkEnd w:id="460"/>
     <w:bookmarkStart w:id="461" w:name="templates"/>
@@ -18879,11 +18639,6 @@
         <w:t xml:space="preserve">Templates</w:t>
       </w:r>
     </w:p>
-    <w:p>
-      <w:r>
-        <w:br w:type="page"/>
-      </w:r>
-    </w:p>
     <w:bookmarkEnd w:id="461"/>
     <w:bookmarkStart w:id="469" w:name="template-proposal-structure"/>
     <w:p>
@@ -19025,11 +18780,6 @@
       </w:pPr>
       <w:r>
         <w:t xml:space="preserve">A single, specific, dated action needed from the buyer. Not "let me know what you think."</w:t>
-      </w:r>
-    </w:p>
-    <w:p>
-      <w:r>
-        <w:br w:type="page"/>
       </w:r>
     </w:p>
     <w:bookmarkEnd w:id="468"/>
@@ -19150,11 +18900,6 @@
         <w:t xml:space="preserve">Competence, reliability, or candour (see Module 3's Trust Pyramid). Base this on what you learn about their past experience with similar purchases.</w:t>
       </w:r>
     </w:p>
-    <w:p>
-      <w:r>
-        <w:br w:type="page"/>
-      </w:r>
-    </w:p>
     <w:bookmarkEnd w:id="475"/>
     <w:bookmarkEnd w:id="476"/>
     <w:bookmarkStart w:id="482" w:name="template-nurture-follow-up-email"/>
@@ -19301,11 +19046,6 @@
       </w:pPr>
       <w:r>
         <w:t xml:space="preserve">Body: Report what happened, win or lose. This message matters more than the ask itself for whether the next referral happens.</w:t>
-      </w:r>
-    </w:p>
-    <w:p>
-      <w:r>
-        <w:br w:type="page"/>
       </w:r>
     </w:p>
     <w:bookmarkEnd w:id="481"/>
@@ -20255,6 +19995,7 @@
     <w:pPr>
       <w:keepNext/>
       <w:keepLines/>
+      <w:pageBreakBefore/>
       <w:spacing w:after="120" w:before="360"/>
       <w:outlineLvl w:val="0"/>
     </w:pPr>

</xml_diff>